<commit_message>
Verify Week 6 coverage and Android builds
</commit_message>
<xml_diff>
--- a/docs/week6/Team1_Week6_Submission_Items.docx
+++ b/docs/week6/Team1_Week6_Submission_Items.docx
@@ -377,7 +377,7 @@
               <w:rPr>
                 <w:sz w:val="17"/>
               </w:rPr>
-              <w:t>Run Flutter coverage and device tests.</w:t>
+              <w:t>Flutter tests passed; run device tests.</w:t>
             </w:r>
           </w:p>
         </w:tc>
@@ -457,7 +457,7 @@
               <w:rPr>
                 <w:sz w:val="17"/>
               </w:rPr>
-              <w:t>Run npm coverage and device tests.</w:t>
+              <w:t>15 suites / 131 tests passed; run device tests.</w:t>
             </w:r>
           </w:p>
         </w:tc>
@@ -509,7 +509,7 @@
               <w:rPr>
                 <w:sz w:val="17"/>
               </w:rPr>
-              <w:t>maestro/ contains four critical workflow definitions.</w:t>
+              <w:t>maestro/ contains six critical workflow definitions.</w:t>
             </w:r>
           </w:p>
         </w:tc>
@@ -588,7 +588,7 @@
               <w:rPr>
                 <w:sz w:val="17"/>
               </w:rPr>
-              <w:t>Existing RN baseline: 82.03% statements / 84.31% lines; regenerated reports required after Week 6 changes.</w:t>
+              <w:t>Flutter: 93.90% lines. React Native: 79.97% statements / 82.08% lines.</w:t>
             </w:r>
           </w:p>
         </w:tc>
@@ -614,7 +614,7 @@
               <w:rPr>
                 <w:sz w:val="17"/>
               </w:rPr>
-              <w:t>Attach final Flutter and RN HTML/summary reports.</w:t>
+              <w:t>Attach the generated coverage reports.</w:t>
             </w:r>
           </w:p>
         </w:tc>

</xml_diff>